<commit_message>
feat(dissertation): update author information and improve document structure
This commit updates the author block in the LaTeX and Word documents to include the names, affiliations, and ORCIDs of the authors, replacing the previous anonymous submission format. Additionally, it enhances the document structure by refining the handling of anonymity in the manuscript generation script, ensuring that the correct author information is displayed based on the anonymity setting. The changes aim to improve the clarity and professionalism of the submission materials.
</commit_message>
<xml_diff>
--- a/docs/dissertation/side2026_submission/SIDe2026_submission.docx
+++ b/docs/dissertation/side2026_submission/SIDe2026_submission.docx
@@ -17,35 +17,245 @@
         <w:t>A Five-Institution Benchmark for Student-Risk Models, and the Reference Points Explanation-Stability Claims Need</w:t>
       </w:r>
     </w:p>
-    <w:p>
-      <w:pPr>
-        <w:spacing w:after="0" w:before="0" w:line="240" w:lineRule="auto"/>
-        <w:jc w:val="center"/>
-      </w:pPr>
-      <w:r>
-        <w:rPr>
-          <w:rFonts w:ascii="Times New Roman" w:hAnsi="Times New Roman"/>
-          <w:b w:val="0"/>
-          <w:i w:val="0"/>
-          <w:sz w:val="22"/>
-        </w:rPr>
-        <w:t>Anonymous submission</w:t>
-      </w:r>
-    </w:p>
+    <w:tbl>
+      <w:tblPr>
+        <w:tblW w:type="auto" w:w="0"/>
+        <w:tblLayout w:type="autofit"/>
+        <w:tblLook w:firstColumn="1" w:firstRow="1" w:lastColumn="0" w:lastRow="0" w:noHBand="0" w:noVBand="1" w:val="04A0"/>
+      </w:tblPr>
+      <w:tblGrid>
+        <w:gridCol w:w="5220"/>
+        <w:gridCol w:w="5220"/>
+      </w:tblGrid>
+      <w:tr>
+        <w:tc>
+          <w:tcPr>
+            <w:tcW w:type="dxa" w:w="5220"/>
+          </w:tcPr>
+          <w:p>
+            <w:pPr>
+              <w:spacing w:after="0"/>
+              <w:jc w:val="center"/>
+            </w:pPr>
+            <w:r/>
+            <w:r>
+              <w:rPr>
+                <w:rFonts w:ascii="Times New Roman" w:hAnsi="Times New Roman"/>
+                <w:b w:val="0"/>
+                <w:i w:val="0"/>
+                <w:sz w:val="22"/>
+              </w:rPr>
+              <w:t>A. S. Talgatov</w:t>
+            </w:r>
+          </w:p>
+          <w:p>
+            <w:pPr>
+              <w:spacing w:after="0"/>
+              <w:jc w:val="center"/>
+            </w:pPr>
+            <w:r>
+              <w:rPr>
+                <w:rFonts w:ascii="Times New Roman" w:hAnsi="Times New Roman"/>
+                <w:b w:val="0"/>
+                <w:i/>
+                <w:sz w:val="19"/>
+              </w:rPr>
+              <w:t>Master degree student</w:t>
+            </w:r>
+          </w:p>
+          <w:p>
+            <w:pPr>
+              <w:spacing w:after="0"/>
+              <w:jc w:val="center"/>
+            </w:pPr>
+            <w:r>
+              <w:rPr>
+                <w:rFonts w:ascii="Times New Roman" w:hAnsi="Times New Roman"/>
+                <w:b w:val="0"/>
+                <w:i/>
+                <w:sz w:val="19"/>
+              </w:rPr>
+              <w:t>School of Software Engineering</w:t>
+            </w:r>
+          </w:p>
+          <w:p>
+            <w:pPr>
+              <w:spacing w:after="0"/>
+              <w:jc w:val="center"/>
+            </w:pPr>
+            <w:r>
+              <w:rPr>
+                <w:rFonts w:ascii="Times New Roman" w:hAnsi="Times New Roman"/>
+                <w:b w:val="0"/>
+                <w:i/>
+                <w:sz w:val="19"/>
+              </w:rPr>
+              <w:t>Astana IT University</w:t>
+            </w:r>
+          </w:p>
+          <w:p>
+            <w:pPr>
+              <w:spacing w:after="0"/>
+              <w:jc w:val="center"/>
+            </w:pPr>
+            <w:r>
+              <w:rPr>
+                <w:rFonts w:ascii="Times New Roman" w:hAnsi="Times New Roman"/>
+                <w:b w:val="0"/>
+                <w:i w:val="0"/>
+                <w:sz w:val="19"/>
+              </w:rPr>
+              <w:t>Astana, Kazakhstan</w:t>
+            </w:r>
+          </w:p>
+          <w:p>
+            <w:pPr>
+              <w:spacing w:after="0"/>
+              <w:jc w:val="center"/>
+            </w:pPr>
+            <w:r>
+              <w:rPr>
+                <w:rFonts w:ascii="Times New Roman" w:hAnsi="Times New Roman"/>
+                <w:b w:val="0"/>
+                <w:i w:val="0"/>
+                <w:sz w:val="19"/>
+              </w:rPr>
+              <w:t>ORCID: 0009-0006-3463-4644</w:t>
+            </w:r>
+          </w:p>
+          <w:p>
+            <w:pPr>
+              <w:spacing w:after="0"/>
+              <w:jc w:val="center"/>
+            </w:pPr>
+            <w:r>
+              <w:rPr>
+                <w:rFonts w:ascii="Times New Roman" w:hAnsi="Times New Roman"/>
+                <w:b w:val="0"/>
+                <w:i w:val="0"/>
+                <w:sz w:val="19"/>
+              </w:rPr>
+              <w:t>a1byn.talgat05@gmail.com</w:t>
+            </w:r>
+          </w:p>
+        </w:tc>
+        <w:tc>
+          <w:tcPr>
+            <w:tcW w:type="dxa" w:w="5220"/>
+          </w:tcPr>
+          <w:p>
+            <w:pPr>
+              <w:spacing w:after="0"/>
+              <w:jc w:val="center"/>
+            </w:pPr>
+            <w:r/>
+            <w:r>
+              <w:rPr>
+                <w:rFonts w:ascii="Times New Roman" w:hAnsi="Times New Roman"/>
+                <w:b w:val="0"/>
+                <w:i w:val="0"/>
+                <w:sz w:val="22"/>
+              </w:rPr>
+              <w:t>S. A. Nurgaliyeva*</w:t>
+            </w:r>
+          </w:p>
+          <w:p>
+            <w:pPr>
+              <w:spacing w:after="0"/>
+              <w:jc w:val="center"/>
+            </w:pPr>
+            <w:r>
+              <w:rPr>
+                <w:rFonts w:ascii="Times New Roman" w:hAnsi="Times New Roman"/>
+                <w:b w:val="0"/>
+                <w:i/>
+                <w:sz w:val="19"/>
+              </w:rPr>
+              <w:t>PhD in computer science</w:t>
+            </w:r>
+          </w:p>
+          <w:p>
+            <w:pPr>
+              <w:spacing w:after="0"/>
+              <w:jc w:val="center"/>
+            </w:pPr>
+            <w:r>
+              <w:rPr>
+                <w:rFonts w:ascii="Times New Roman" w:hAnsi="Times New Roman"/>
+                <w:b w:val="0"/>
+                <w:i/>
+                <w:sz w:val="19"/>
+              </w:rPr>
+              <w:t>School of Software Engineering</w:t>
+            </w:r>
+          </w:p>
+          <w:p>
+            <w:pPr>
+              <w:spacing w:after="0"/>
+              <w:jc w:val="center"/>
+            </w:pPr>
+            <w:r>
+              <w:rPr>
+                <w:rFonts w:ascii="Times New Roman" w:hAnsi="Times New Roman"/>
+                <w:b w:val="0"/>
+                <w:i/>
+                <w:sz w:val="19"/>
+              </w:rPr>
+              <w:t>Astana IT University</w:t>
+            </w:r>
+          </w:p>
+          <w:p>
+            <w:pPr>
+              <w:spacing w:after="0"/>
+              <w:jc w:val="center"/>
+            </w:pPr>
+            <w:r>
+              <w:rPr>
+                <w:rFonts w:ascii="Times New Roman" w:hAnsi="Times New Roman"/>
+                <w:b w:val="0"/>
+                <w:i w:val="0"/>
+                <w:sz w:val="19"/>
+              </w:rPr>
+              <w:t>Astana, Kazakhstan</w:t>
+            </w:r>
+          </w:p>
+          <w:p>
+            <w:pPr>
+              <w:spacing w:after="0"/>
+              <w:jc w:val="center"/>
+            </w:pPr>
+            <w:r>
+              <w:rPr>
+                <w:rFonts w:ascii="Times New Roman" w:hAnsi="Times New Roman"/>
+                <w:b w:val="0"/>
+                <w:i w:val="0"/>
+                <w:sz w:val="19"/>
+              </w:rPr>
+              <w:t>ORCID: 0009-0009-5880-6166</w:t>
+            </w:r>
+          </w:p>
+          <w:p>
+            <w:pPr>
+              <w:spacing w:after="0"/>
+              <w:jc w:val="center"/>
+            </w:pPr>
+            <w:r>
+              <w:rPr>
+                <w:rFonts w:ascii="Times New Roman" w:hAnsi="Times New Roman"/>
+                <w:b w:val="0"/>
+                <w:i w:val="0"/>
+                <w:sz w:val="19"/>
+              </w:rPr>
+              <w:t>symbat.nurgaliyeva@astanait.edu.kz</w:t>
+            </w:r>
+          </w:p>
+        </w:tc>
+      </w:tr>
+    </w:tbl>
     <w:p>
       <w:pPr>
         <w:spacing w:after="200" w:before="0" w:line="240" w:lineRule="auto"/>
-        <w:jc w:val="center"/>
       </w:pPr>
-      <w:r>
-        <w:rPr>
-          <w:rFonts w:ascii="Times New Roman" w:hAnsi="Times New Roman"/>
-          <w:b w:val="0"/>
-          <w:i/>
-          <w:sz w:val="22"/>
-        </w:rPr>
-        <w:t>Paper ID: assigned by CMT — blind review</w:t>
-      </w:r>
     </w:p>
     <w:p>
       <w:pPr>
@@ -1866,7 +2076,7 @@
       <w:r>
         <w:drawing>
           <wp:inline xmlns:a="http://schemas.openxmlformats.org/drawingml/2006/main" xmlns:pic="http://schemas.openxmlformats.org/drawingml/2006/picture">
-            <wp:extent cx="3017520" cy="3107351"/>
+            <wp:extent cx="3017520" cy="2568363"/>
             <wp:docPr id="1" name="Picture 1"/>
             <wp:cNvGraphicFramePr>
               <a:graphicFrameLocks noChangeAspect="1"/>
@@ -1887,7 +2097,7 @@
                   <pic:spPr>
                     <a:xfrm>
                       <a:off x="0" y="0"/>
-                      <a:ext cx="3017520" cy="3107351"/>
+                      <a:ext cx="3017520" cy="2568363"/>
                     </a:xfrm>
                     <a:prstGeom prst="rect"/>
                   </pic:spPr>
@@ -3072,7 +3282,7 @@
           <w:i w:val="0"/>
           <w:sz w:val="20"/>
         </w:rPr>
-        <w:t>We release the five institution adapters, the cohort definitions, the experiment code and the frozen result files, together with a script that recomputes every number in this paper from those files. We do not redistribute the underlying student data: each source is published by its own institution under its own licence, and the adapters read those releases in place. An anonymised repository is linked from the submission record; the permanent link replaces this note in the camera-ready version.</w:t>
+        <w:t>We release the five institution adapters, the cohort definitions, the experiment code and the frozen result files, together with a script that recomputes every number in this paper from those files. We do not redistribute the underlying student data: each source is published by its own institution under its own licence, and the adapters read those releases in place. Everything named here is at &lt;repository URL&gt;.</w:t>
       </w:r>
     </w:p>
     <w:p>

</xml_diff>

<commit_message>
chore: enhance .gitignore and update dissertation materials
This commit updates the .gitignore file to ensure that frozen result files and specific dataset directories are tracked correctly, allowing necessary CSV files to be included while excluding irrelevant data. Additionally, it modifies the LaTeX and README files to improve author information presentation and clarify the status of the frozen results, ensuring that the documentation reflects the current state of the project accurately. The changes aim to streamline the repository and enhance the clarity of submission materials.
</commit_message>
<xml_diff>
--- a/docs/dissertation/side2026_submission/SIDe2026_submission.docx
+++ b/docs/dissertation/side2026_submission/SIDe2026_submission.docx
@@ -24,13 +24,14 @@
         <w:tblLook w:firstColumn="1" w:firstRow="1" w:lastColumn="0" w:lastRow="0" w:noHBand="0" w:noVBand="1" w:val="04A0"/>
       </w:tblPr>
       <w:tblGrid>
-        <w:gridCol w:w="5220"/>
-        <w:gridCol w:w="5220"/>
+        <w:gridCol w:w="3480"/>
+        <w:gridCol w:w="3480"/>
+        <w:gridCol w:w="3480"/>
       </w:tblGrid>
       <w:tr>
         <w:tc>
           <w:tcPr>
-            <w:tcW w:type="dxa" w:w="5220"/>
+            <w:tcW w:type="dxa" w:w="3480"/>
           </w:tcPr>
           <w:p>
             <w:pPr>
@@ -141,7 +142,7 @@
         </w:tc>
         <w:tc>
           <w:tcPr>
-            <w:tcW w:type="dxa" w:w="5220"/>
+            <w:tcW w:type="dxa" w:w="3480"/>
           </w:tcPr>
           <w:p>
             <w:pPr>
@@ -247,6 +248,422 @@
                 <w:sz w:val="19"/>
               </w:rPr>
               <w:t>symbat.nurgaliyeva@astanait.edu.kz</w:t>
+            </w:r>
+          </w:p>
+        </w:tc>
+        <w:tc>
+          <w:tcPr>
+            <w:tcW w:type="dxa" w:w="3480"/>
+          </w:tcPr>
+          <w:p>
+            <w:pPr>
+              <w:spacing w:after="0"/>
+              <w:jc w:val="center"/>
+            </w:pPr>
+            <w:r/>
+            <w:r>
+              <w:rPr>
+                <w:rFonts w:ascii="Times New Roman" w:hAnsi="Times New Roman"/>
+                <w:b w:val="0"/>
+                <w:i w:val="0"/>
+                <w:sz w:val="22"/>
+              </w:rPr>
+              <w:t>Z. Basheyeva</w:t>
+            </w:r>
+          </w:p>
+          <w:p>
+            <w:pPr>
+              <w:spacing w:after="0"/>
+              <w:jc w:val="center"/>
+            </w:pPr>
+            <w:r>
+              <w:rPr>
+                <w:rFonts w:ascii="Times New Roman" w:hAnsi="Times New Roman"/>
+                <w:b w:val="0"/>
+                <w:i/>
+                <w:sz w:val="19"/>
+              </w:rPr>
+              <w:t>School of Software Engineering</w:t>
+            </w:r>
+          </w:p>
+          <w:p>
+            <w:pPr>
+              <w:spacing w:after="0"/>
+              <w:jc w:val="center"/>
+            </w:pPr>
+            <w:r>
+              <w:rPr>
+                <w:rFonts w:ascii="Times New Roman" w:hAnsi="Times New Roman"/>
+                <w:b w:val="0"/>
+                <w:i/>
+                <w:sz w:val="19"/>
+              </w:rPr>
+              <w:t>Astana IT University</w:t>
+            </w:r>
+          </w:p>
+          <w:p>
+            <w:pPr>
+              <w:spacing w:after="0"/>
+              <w:jc w:val="center"/>
+            </w:pPr>
+            <w:r>
+              <w:rPr>
+                <w:rFonts w:ascii="Times New Roman" w:hAnsi="Times New Roman"/>
+                <w:b w:val="0"/>
+                <w:i w:val="0"/>
+                <w:sz w:val="19"/>
+              </w:rPr>
+              <w:t>Astana, Kazakhstan</w:t>
+            </w:r>
+          </w:p>
+          <w:p>
+            <w:pPr>
+              <w:spacing w:after="0"/>
+              <w:jc w:val="center"/>
+            </w:pPr>
+            <w:r>
+              <w:rPr>
+                <w:rFonts w:ascii="Times New Roman" w:hAnsi="Times New Roman"/>
+                <w:b w:val="0"/>
+                <w:i w:val="0"/>
+                <w:sz w:val="19"/>
+              </w:rPr>
+              <w:t>ORCID: 0000-0001-9605-2101</w:t>
+            </w:r>
+          </w:p>
+          <w:p>
+            <w:pPr>
+              <w:spacing w:after="0"/>
+              <w:jc w:val="center"/>
+            </w:pPr>
+            <w:r>
+              <w:rPr>
+                <w:rFonts w:ascii="Times New Roman" w:hAnsi="Times New Roman"/>
+                <w:b w:val="0"/>
+                <w:i w:val="0"/>
+                <w:sz w:val="19"/>
+              </w:rPr>
+              <w:t>zhuldyz.basheyeva@astanait.edu.kz</w:t>
+            </w:r>
+          </w:p>
+        </w:tc>
+      </w:tr>
+      <w:tr>
+        <w:tc>
+          <w:tcPr>
+            <w:tcW w:type="dxa" w:w="3480"/>
+          </w:tcPr>
+          <w:p>
+            <w:pPr>
+              <w:spacing w:after="0"/>
+              <w:jc w:val="center"/>
+            </w:pPr>
+            <w:r/>
+            <w:r>
+              <w:rPr>
+                <w:rFonts w:ascii="Times New Roman" w:hAnsi="Times New Roman"/>
+                <w:b w:val="0"/>
+                <w:i w:val="0"/>
+                <w:sz w:val="22"/>
+              </w:rPr>
+              <w:t>A. Sakhipov</w:t>
+            </w:r>
+          </w:p>
+          <w:p>
+            <w:pPr>
+              <w:spacing w:after="0"/>
+              <w:jc w:val="center"/>
+            </w:pPr>
+            <w:r>
+              <w:rPr>
+                <w:rFonts w:ascii="Times New Roman" w:hAnsi="Times New Roman"/>
+                <w:b w:val="0"/>
+                <w:i/>
+                <w:sz w:val="19"/>
+              </w:rPr>
+              <w:t>PhD, Assistant Professor</w:t>
+            </w:r>
+          </w:p>
+          <w:p>
+            <w:pPr>
+              <w:spacing w:after="0"/>
+              <w:jc w:val="center"/>
+            </w:pPr>
+            <w:r>
+              <w:rPr>
+                <w:rFonts w:ascii="Times New Roman" w:hAnsi="Times New Roman"/>
+                <w:b w:val="0"/>
+                <w:i/>
+                <w:sz w:val="19"/>
+              </w:rPr>
+              <w:t>IEEE Senior Member</w:t>
+            </w:r>
+          </w:p>
+          <w:p>
+            <w:pPr>
+              <w:spacing w:after="0"/>
+              <w:jc w:val="center"/>
+            </w:pPr>
+            <w:r>
+              <w:rPr>
+                <w:rFonts w:ascii="Times New Roman" w:hAnsi="Times New Roman"/>
+                <w:b w:val="0"/>
+                <w:i/>
+                <w:sz w:val="19"/>
+              </w:rPr>
+              <w:t>School of Software Engineering</w:t>
+            </w:r>
+          </w:p>
+          <w:p>
+            <w:pPr>
+              <w:spacing w:after="0"/>
+              <w:jc w:val="center"/>
+            </w:pPr>
+            <w:r>
+              <w:rPr>
+                <w:rFonts w:ascii="Times New Roman" w:hAnsi="Times New Roman"/>
+                <w:b w:val="0"/>
+                <w:i/>
+                <w:sz w:val="19"/>
+              </w:rPr>
+              <w:t>Astana IT University</w:t>
+            </w:r>
+          </w:p>
+          <w:p>
+            <w:pPr>
+              <w:spacing w:after="0"/>
+              <w:jc w:val="center"/>
+            </w:pPr>
+            <w:r>
+              <w:rPr>
+                <w:rFonts w:ascii="Times New Roman" w:hAnsi="Times New Roman"/>
+                <w:b w:val="0"/>
+                <w:i w:val="0"/>
+                <w:sz w:val="19"/>
+              </w:rPr>
+              <w:t>Astana, Kazakhstan</w:t>
+            </w:r>
+          </w:p>
+          <w:p>
+            <w:pPr>
+              <w:spacing w:after="0"/>
+              <w:jc w:val="center"/>
+            </w:pPr>
+            <w:r>
+              <w:rPr>
+                <w:rFonts w:ascii="Times New Roman" w:hAnsi="Times New Roman"/>
+                <w:b w:val="0"/>
+                <w:i w:val="0"/>
+                <w:sz w:val="19"/>
+              </w:rPr>
+              <w:t>ORCID: 0000-0003-1045-4199</w:t>
+            </w:r>
+          </w:p>
+          <w:p>
+            <w:pPr>
+              <w:spacing w:after="0"/>
+              <w:jc w:val="center"/>
+            </w:pPr>
+            <w:r>
+              <w:rPr>
+                <w:rFonts w:ascii="Times New Roman" w:hAnsi="Times New Roman"/>
+                <w:b w:val="0"/>
+                <w:i w:val="0"/>
+                <w:sz w:val="19"/>
+              </w:rPr>
+              <w:t>aivar.sakhipov@astanait.edu.kz</w:t>
+            </w:r>
+          </w:p>
+        </w:tc>
+        <w:tc>
+          <w:tcPr>
+            <w:tcW w:type="dxa" w:w="3480"/>
+          </w:tcPr>
+          <w:p>
+            <w:pPr>
+              <w:spacing w:after="0"/>
+              <w:jc w:val="center"/>
+            </w:pPr>
+            <w:r/>
+            <w:r>
+              <w:rPr>
+                <w:rFonts w:ascii="Times New Roman" w:hAnsi="Times New Roman"/>
+                <w:b w:val="0"/>
+                <w:i w:val="0"/>
+                <w:sz w:val="22"/>
+              </w:rPr>
+              <w:t>N. Turysbek</w:t>
+            </w:r>
+          </w:p>
+          <w:p>
+            <w:pPr>
+              <w:spacing w:after="0"/>
+              <w:jc w:val="center"/>
+            </w:pPr>
+            <w:r>
+              <w:rPr>
+                <w:rFonts w:ascii="Times New Roman" w:hAnsi="Times New Roman"/>
+                <w:b w:val="0"/>
+                <w:i/>
+                <w:sz w:val="19"/>
+              </w:rPr>
+              <w:t>School of Cybersecurity</w:t>
+            </w:r>
+          </w:p>
+          <w:p>
+            <w:pPr>
+              <w:spacing w:after="0"/>
+              <w:jc w:val="center"/>
+            </w:pPr>
+            <w:r>
+              <w:rPr>
+                <w:rFonts w:ascii="Times New Roman" w:hAnsi="Times New Roman"/>
+                <w:b w:val="0"/>
+                <w:i/>
+                <w:sz w:val="19"/>
+              </w:rPr>
+              <w:t>Astana IT University</w:t>
+            </w:r>
+          </w:p>
+          <w:p>
+            <w:pPr>
+              <w:spacing w:after="0"/>
+              <w:jc w:val="center"/>
+            </w:pPr>
+            <w:r>
+              <w:rPr>
+                <w:rFonts w:ascii="Times New Roman" w:hAnsi="Times New Roman"/>
+                <w:b w:val="0"/>
+                <w:i w:val="0"/>
+                <w:sz w:val="19"/>
+              </w:rPr>
+              <w:t>Astana, Kazakhstan</w:t>
+            </w:r>
+          </w:p>
+          <w:p>
+            <w:pPr>
+              <w:spacing w:after="0"/>
+              <w:jc w:val="center"/>
+            </w:pPr>
+            <w:r>
+              <w:rPr>
+                <w:rFonts w:ascii="Times New Roman" w:hAnsi="Times New Roman"/>
+                <w:b w:val="0"/>
+                <w:i w:val="0"/>
+                <w:sz w:val="19"/>
+              </w:rPr>
+              <w:t>ORCID: 0009-0000-0932-3525</w:t>
+            </w:r>
+          </w:p>
+          <w:p>
+            <w:pPr>
+              <w:spacing w:after="0"/>
+              <w:jc w:val="center"/>
+            </w:pPr>
+            <w:r>
+              <w:rPr>
+                <w:rFonts w:ascii="Times New Roman" w:hAnsi="Times New Roman"/>
+                <w:b w:val="0"/>
+                <w:i w:val="0"/>
+                <w:sz w:val="19"/>
+              </w:rPr>
+              <w:t>n.turysbek@astanait.edu.kz</w:t>
+            </w:r>
+          </w:p>
+        </w:tc>
+        <w:tc>
+          <w:tcPr>
+            <w:tcW w:type="dxa" w:w="3480"/>
+          </w:tcPr>
+          <w:p>
+            <w:pPr>
+              <w:spacing w:after="0"/>
+              <w:jc w:val="center"/>
+            </w:pPr>
+            <w:r/>
+            <w:r>
+              <w:rPr>
+                <w:rFonts w:ascii="Times New Roman" w:hAnsi="Times New Roman"/>
+                <w:b w:val="0"/>
+                <w:i w:val="0"/>
+                <w:sz w:val="22"/>
+              </w:rPr>
+              <w:t>M. Kali</w:t>
+            </w:r>
+          </w:p>
+          <w:p>
+            <w:pPr>
+              <w:spacing w:after="0"/>
+              <w:jc w:val="center"/>
+            </w:pPr>
+            <w:r>
+              <w:rPr>
+                <w:rFonts w:ascii="Times New Roman" w:hAnsi="Times New Roman"/>
+                <w:b w:val="0"/>
+                <w:i/>
+                <w:sz w:val="19"/>
+              </w:rPr>
+              <w:t>School of Cybersecurity</w:t>
+            </w:r>
+          </w:p>
+          <w:p>
+            <w:pPr>
+              <w:spacing w:after="0"/>
+              <w:jc w:val="center"/>
+            </w:pPr>
+            <w:r>
+              <w:rPr>
+                <w:rFonts w:ascii="Times New Roman" w:hAnsi="Times New Roman"/>
+                <w:b w:val="0"/>
+                <w:i/>
+                <w:sz w:val="19"/>
+              </w:rPr>
+              <w:t>Astana IT University</w:t>
+            </w:r>
+          </w:p>
+          <w:p>
+            <w:pPr>
+              <w:spacing w:after="0"/>
+              <w:jc w:val="center"/>
+            </w:pPr>
+            <w:r>
+              <w:rPr>
+                <w:rFonts w:ascii="Times New Roman" w:hAnsi="Times New Roman"/>
+                <w:b w:val="0"/>
+                <w:i w:val="0"/>
+                <w:sz w:val="19"/>
+              </w:rPr>
+              <w:t>Astana, Kazakhstan</w:t>
+            </w:r>
+          </w:p>
+          <w:p>
+            <w:pPr>
+              <w:spacing w:after="0"/>
+              <w:jc w:val="center"/>
+            </w:pPr>
+            <w:r>
+              <w:rPr>
+                <w:rFonts w:ascii="Times New Roman" w:hAnsi="Times New Roman"/>
+                <w:b w:val="0"/>
+                <w:i w:val="0"/>
+                <w:sz w:val="19"/>
+              </w:rPr>
+              <w:t>ORCID: 0000-0001-5588-8164</w:t>
+            </w:r>
+          </w:p>
+          <w:p>
+            <w:pPr>
+              <w:spacing w:after="0"/>
+              <w:jc w:val="center"/>
+            </w:pPr>
+            <w:r>
+              <w:rPr>
+                <w:rFonts w:ascii="Times New Roman" w:hAnsi="Times New Roman"/>
+                <w:b w:val="0"/>
+                <w:i w:val="0"/>
+                <w:sz w:val="19"/>
+              </w:rPr>
+              <w:t>marzhan.kali@astanait.edu.kz</w:t>
             </w:r>
           </w:p>
         </w:tc>
@@ -3282,7 +3699,7 @@
           <w:i w:val="0"/>
           <w:sz w:val="20"/>
         </w:rPr>
-        <w:t>We release the five institution adapters, the cohort definitions, the experiment code and the frozen result files, together with a script that recomputes every number in this paper from those files. We do not redistribute the underlying student data: each source is published by its own institution under its own licence, and the adapters read those releases in place. Everything named here is at &lt;repository URL&gt;.</w:t>
+        <w:t>We release the five institution adapters, the cohort definitions, the experiment code and the frozen result files, together with a script that recomputes every number in this paper from those files. We redistribute none of the student data. All five releases are published openly by their originating institutions, four of them under a DOI, and the repository records for each the source, the licence and the path an adapter expects, so the adapters read a copy the reuser downloads. Everything named here is at https://github.com/a169n/student-digital-twin-xai.</w:t>
       </w:r>
     </w:p>
     <w:p>

</xml_diff>

<commit_message>
feat(dissertation): enhance terminology and references in LaTeX document
This commit introduces a new section on terminology related to digital twins, digital shadows, and their implications in educational contexts. It also adds relevant citations to support the discussion, ensuring clarity and depth in the manuscript. Additionally, updates are made to the PDF and Word document formats to reflect these changes, improving the overall quality of the submission materials.
</commit_message>
<xml_diff>
--- a/docs/dissertation/side2026_submission/SIDe2026_submission.docx
+++ b/docs/dissertation/side2026_submission/SIDe2026_submission.docx
@@ -2172,6 +2172,84 @@
           <w:sz w:val="20"/>
         </w:rPr>
         <w:t>Each adapter emits four weekly counters per student — clicks, active days, content clicks, social clicks — from which seven leakage-safe features are derived identically: four cumulative counters, current-week clicks, active weeks so far, and weeks since last activity. No demographic or assessment feature enters the models; three institutions publish none. Course lengths run from 14 to 46 weeks, so the prediction point is relative: one row per student at week ⌈ 1/3 × length ⌉, repeated at 1/4 and 1/2.</w:t>
+      </w:r>
+    </w:p>
+    <w:p>
+      <w:pPr>
+        <w:spacing w:after="80" w:before="0" w:line="240" w:lineRule="auto"/>
+        <w:ind w:firstLine="288"/>
+      </w:pPr>
+      <w:r>
+        <w:rPr>
+          <w:rFonts w:ascii="Times New Roman" w:hAnsi="Times New Roman"/>
+          <w:b/>
+          <w:i w:val="0"/>
+          <w:sz w:val="20"/>
+        </w:rPr>
+        <w:t>Terminology.</w:t>
+      </w:r>
+      <w:r>
+        <w:rPr>
+          <w:rFonts w:ascii="Times New Roman" w:hAnsi="Times New Roman"/>
+          <w:b w:val="0"/>
+          <w:i w:val="0"/>
+          <w:sz w:val="20"/>
+        </w:rPr>
+        <w:t xml:space="preserve"> This per-student weekly state is often called a digital twin of the learner, and the term is graded. Kritzinger et al. separate its levels by data flow: a </w:t>
+      </w:r>
+      <w:r>
+        <w:rPr>
+          <w:rFonts w:ascii="Times New Roman" w:hAnsi="Times New Roman"/>
+          <w:b w:val="0"/>
+          <w:i/>
+          <w:sz w:val="20"/>
+        </w:rPr>
+        <w:t>digital model</w:t>
+      </w:r>
+      <w:r>
+        <w:rPr>
+          <w:rFonts w:ascii="Times New Roman" w:hAnsi="Times New Roman"/>
+          <w:b w:val="0"/>
+          <w:i w:val="0"/>
+          <w:sz w:val="20"/>
+        </w:rPr>
+        <w:t xml:space="preserve"> exchanges nothing automatically, a </w:t>
+      </w:r>
+      <w:r>
+        <w:rPr>
+          <w:rFonts w:ascii="Times New Roman" w:hAnsi="Times New Roman"/>
+          <w:b w:val="0"/>
+          <w:i/>
+          <w:sz w:val="20"/>
+        </w:rPr>
+        <w:t>digital shadow</w:t>
+      </w:r>
+      <w:r>
+        <w:rPr>
+          <w:rFonts w:ascii="Times New Roman" w:hAnsi="Times New Roman"/>
+          <w:b w:val="0"/>
+          <w:i w:val="0"/>
+          <w:sz w:val="20"/>
+        </w:rPr>
+        <w:t xml:space="preserve"> carries an automated one-way flow from the object to its representation, and a </w:t>
+      </w:r>
+      <w:r>
+        <w:rPr>
+          <w:rFonts w:ascii="Times New Roman" w:hAnsi="Times New Roman"/>
+          <w:b w:val="0"/>
+          <w:i/>
+          <w:sz w:val="20"/>
+        </w:rPr>
+        <w:t>digital twin</w:t>
+      </w:r>
+      <w:r>
+        <w:rPr>
+          <w:rFonts w:ascii="Times New Roman" w:hAnsi="Times New Roman"/>
+          <w:b w:val="0"/>
+          <w:i w:val="0"/>
+          <w:sz w:val="20"/>
+        </w:rPr>
+        <w:t xml:space="preserve"> closes the loop with a flow back [23]; Addanki and Corrin apply the two-way requirement to learners specifically [24]. Our schema is one-way by construction — logs advance the representation and nothing is written back to the student — so it is a digital shadow of the learner, and we claim no simulation, counterfactual or intervention capability. Systems that do close the loop keep a human inside it: mobile formative-assessment designs route model-scored responses through a teacher who can inspect and override them before feedback reaches the student [25]. That review step is the safeguard our correlational evidence cannot supply on its own. The distinction is load-bearing here rather than pedantic. Closing the loop means acting on the representation, and acting on it means reading its feature attributions causally — which is precisely what Section V-B argues against, since the attributions move more between estimators than the effect under study. A representation whose explanations are this unstable has no warrant to write back.</w:t>
       </w:r>
     </w:p>
     <w:p>
@@ -4579,6 +4657,129 @@
         <w:t xml:space="preserve">, vol. 5, no. 2, pp. 86–104, 2018. </w:t>
       </w:r>
     </w:p>
+    <w:p>
+      <w:pPr>
+        <w:spacing w:after="40" w:before="0" w:line="240" w:lineRule="auto"/>
+      </w:pPr>
+      <w:r>
+        <w:rPr>
+          <w:rFonts w:ascii="Times New Roman" w:hAnsi="Times New Roman"/>
+          <w:b w:val="0"/>
+          <w:i w:val="0"/>
+          <w:sz w:val="16"/>
+        </w:rPr>
+        <w:t xml:space="preserve">[23] </w:t>
+      </w:r>
+      <w:r>
+        <w:rPr>
+          <w:rFonts w:ascii="Times New Roman" w:hAnsi="Times New Roman"/>
+          <w:b w:val="0"/>
+          <w:i w:val="0"/>
+          <w:sz w:val="16"/>
+        </w:rPr>
+        <w:t xml:space="preserve"> W. Kritzinger, M. Karner, G. Traar, J. Henjes, and W. Sihn, “Digital Twin in manufacturing: a categorical literature review and classification,” </w:t>
+      </w:r>
+      <w:r>
+        <w:rPr>
+          <w:rFonts w:ascii="Times New Roman" w:hAnsi="Times New Roman"/>
+          <w:b w:val="0"/>
+          <w:i/>
+          <w:sz w:val="16"/>
+        </w:rPr>
+        <w:t>IFAC-PapersOnLine</w:t>
+      </w:r>
+      <w:r>
+        <w:rPr>
+          <w:rFonts w:ascii="Times New Roman" w:hAnsi="Times New Roman"/>
+          <w:b w:val="0"/>
+          <w:i w:val="0"/>
+          <w:sz w:val="16"/>
+        </w:rPr>
+        <w:t xml:space="preserve">, vol. 51, no. 11, pp. 1016–1022, 2018. </w:t>
+      </w:r>
+    </w:p>
+    <w:p>
+      <w:pPr>
+        <w:spacing w:after="40" w:before="0" w:line="240" w:lineRule="auto"/>
+      </w:pPr>
+      <w:r>
+        <w:rPr>
+          <w:rFonts w:ascii="Times New Roman" w:hAnsi="Times New Roman"/>
+          <w:b w:val="0"/>
+          <w:i w:val="0"/>
+          <w:sz w:val="16"/>
+        </w:rPr>
+        <w:t xml:space="preserve">[24] </w:t>
+      </w:r>
+      <w:r>
+        <w:rPr>
+          <w:rFonts w:ascii="Times New Roman" w:hAnsi="Times New Roman"/>
+          <w:b w:val="0"/>
+          <w:i w:val="0"/>
+          <w:sz w:val="16"/>
+        </w:rPr>
+        <w:t xml:space="preserve"> K. Addanki and L. Corrin, “Unveiling the potential of Digital Twin technology for Higher Education,” in </w:t>
+      </w:r>
+      <w:r>
+        <w:rPr>
+          <w:rFonts w:ascii="Times New Roman" w:hAnsi="Times New Roman"/>
+          <w:b w:val="0"/>
+          <w:i/>
+          <w:sz w:val="16"/>
+        </w:rPr>
+        <w:t>Proc. ASCILITE 2023: People, Partnerships and Pedagogies</w:t>
+      </w:r>
+      <w:r>
+        <w:rPr>
+          <w:rFonts w:ascii="Times New Roman" w:hAnsi="Times New Roman"/>
+          <w:b w:val="0"/>
+          <w:i w:val="0"/>
+          <w:sz w:val="16"/>
+        </w:rPr>
+        <w:t xml:space="preserve">, ASCILITE Publications, 2023. </w:t>
+      </w:r>
+    </w:p>
+    <w:p>
+      <w:pPr>
+        <w:spacing w:after="40" w:before="0" w:line="240" w:lineRule="auto"/>
+      </w:pPr>
+      <w:r>
+        <w:rPr>
+          <w:rFonts w:ascii="Times New Roman" w:hAnsi="Times New Roman"/>
+          <w:b w:val="0"/>
+          <w:i w:val="0"/>
+          <w:sz w:val="16"/>
+        </w:rPr>
+        <w:t xml:space="preserve">[25] </w:t>
+      </w:r>
+      <w:r>
+        <w:rPr>
+          <w:rFonts w:ascii="Times New Roman" w:hAnsi="Times New Roman"/>
+          <w:b w:val="0"/>
+          <w:i w:val="0"/>
+          <w:sz w:val="16"/>
+        </w:rPr>
+        <w:t xml:space="preserve"> A. Yerniyazov, B. Bakayeva, Z. Iztayev, P. Kozhabekova, and S. Nurgaliyeva, “A mobile system for formative assessment and teacher-reviewed feedback,” </w:t>
+      </w:r>
+      <w:r>
+        <w:rPr>
+          <w:rFonts w:ascii="Times New Roman" w:hAnsi="Times New Roman"/>
+          <w:b w:val="0"/>
+          <w:i/>
+          <w:sz w:val="16"/>
+        </w:rPr>
+        <w:t>Int. J. Interact. Mobile Technol.</w:t>
+      </w:r>
+      <w:r>
+        <w:rPr>
+          <w:rFonts w:ascii="Times New Roman" w:hAnsi="Times New Roman"/>
+          <w:b w:val="0"/>
+          <w:i w:val="0"/>
+          <w:sz w:val="16"/>
+        </w:rPr>
+        <w:t xml:space="preserve">, vol. 20, no. 15, pp. 37–50, 2026. </w:t>
+      </w:r>
+    </w:p>
     <w:sectPr>
       <w:type w:val="continuous"/>
       <w:pgSz w:w="12240" w:h="15840"/>

</xml_diff>